<commit_message>
Render report formulas as images
</commit_message>
<xml_diff>
--- a/report_template.docx
+++ b/report_template.docx
@@ -804,22 +804,41 @@
         <w:spacing w:line="360" w:lineRule="auto" w:before="120" w:after="120"/>
       </w:pPr>
       <w:r>
-        <w:rPr>
-          <w:rFonts w:ascii="Times New Roman" w:hAnsi="Times New Roman" w:eastAsia="Times New Roman"/>
-          <w:b w:val="0"/>
-          <w:i w:val="0"/>
-          <w:sz w:val="28"/>
-        </w:rPr>
         <w:tab/>
       </w:r>
       <w:r>
-        <w:rPr>
-          <w:rFonts w:ascii="Times New Roman" w:hAnsi="Times New Roman" w:eastAsia="Times New Roman"/>
-          <w:b w:val="0"/>
-          <w:i w:val="0"/>
-          <w:sz w:val="28"/>
-        </w:rPr>
-        <w:t>f(x, y) = 2·(x − 3)² + 3·(y + 2)² − 2·x·y + 4·x − 6·y,</w:t>
+        <w:drawing>
+          <wp:inline xmlns:a="http://schemas.openxmlformats.org/drawingml/2006/main" xmlns:pic="http://schemas.openxmlformats.org/drawingml/2006/picture">
+            <wp:extent cx="5145024" cy="335280"/>
+            <wp:docPr id="1" name="Picture 1"/>
+            <wp:cNvGraphicFramePr>
+              <a:graphicFrameLocks noChangeAspect="1"/>
+            </wp:cNvGraphicFramePr>
+            <a:graphic>
+              <a:graphicData uri="http://schemas.openxmlformats.org/drawingml/2006/picture">
+                <pic:pic>
+                  <pic:nvPicPr>
+                    <pic:cNvPr id="0" name="formula_040d1f4ad12540a6.png"/>
+                    <pic:cNvPicPr/>
+                  </pic:nvPicPr>
+                  <pic:blipFill>
+                    <a:blip r:embed="rId10"/>
+                    <a:stretch>
+                      <a:fillRect/>
+                    </a:stretch>
+                  </pic:blipFill>
+                  <pic:spPr>
+                    <a:xfrm>
+                      <a:off x="0" y="0"/>
+                      <a:ext cx="5145024" cy="335280"/>
+                    </a:xfrm>
+                    <a:prstGeom prst="rect"/>
+                  </pic:spPr>
+                </pic:pic>
+              </a:graphicData>
+            </a:graphic>
+          </wp:inline>
+        </w:drawing>
       </w:r>
       <w:r>
         <w:rPr>
@@ -1013,22 +1032,41 @@
         <w:spacing w:line="360" w:lineRule="auto" w:before="120" w:after="120"/>
       </w:pPr>
       <w:r>
-        <w:rPr>
-          <w:rFonts w:ascii="Times New Roman" w:hAnsi="Times New Roman" w:eastAsia="Times New Roman"/>
-          <w:b w:val="0"/>
-          <w:i w:val="0"/>
-          <w:sz w:val="28"/>
-        </w:rPr>
         <w:tab/>
       </w:r>
       <w:r>
-        <w:rPr>
-          <w:rFonts w:ascii="Times New Roman" w:hAnsi="Times New Roman" w:eastAsia="Times New Roman"/>
-          <w:b w:val="0"/>
-          <w:i w:val="0"/>
-          <w:sz w:val="28"/>
-        </w:rPr>
-        <w:t>f(x, y) = 2x² + 3y² − 2xy − 8x + 6y + 30.</w:t>
+        <w:drawing>
+          <wp:inline xmlns:a="http://schemas.openxmlformats.org/drawingml/2006/main" xmlns:pic="http://schemas.openxmlformats.org/drawingml/2006/picture">
+            <wp:extent cx="4523232" cy="335280"/>
+            <wp:docPr id="2" name="Picture 2"/>
+            <wp:cNvGraphicFramePr>
+              <a:graphicFrameLocks noChangeAspect="1"/>
+            </wp:cNvGraphicFramePr>
+            <a:graphic>
+              <a:graphicData uri="http://schemas.openxmlformats.org/drawingml/2006/picture">
+                <pic:pic>
+                  <pic:nvPicPr>
+                    <pic:cNvPr id="0" name="formula_c702f717c906531f.png"/>
+                    <pic:cNvPicPr/>
+                  </pic:nvPicPr>
+                  <pic:blipFill>
+                    <a:blip r:embed="rId11"/>
+                    <a:stretch>
+                      <a:fillRect/>
+                    </a:stretch>
+                  </pic:blipFill>
+                  <pic:spPr>
+                    <a:xfrm>
+                      <a:off x="0" y="0"/>
+                      <a:ext cx="4523232" cy="335280"/>
+                    </a:xfrm>
+                    <a:prstGeom prst="rect"/>
+                  </pic:spPr>
+                </pic:pic>
+              </a:graphicData>
+            </a:graphic>
+          </wp:inline>
+        </w:drawing>
       </w:r>
       <w:r>
         <w:rPr>
@@ -1098,22 +1136,41 @@
         <w:spacing w:line="360" w:lineRule="auto" w:before="120" w:after="120"/>
       </w:pPr>
       <w:r>
-        <w:rPr>
-          <w:rFonts w:ascii="Times New Roman" w:hAnsi="Times New Roman" w:eastAsia="Times New Roman"/>
-          <w:b w:val="0"/>
-          <w:i w:val="0"/>
-          <w:sz w:val="28"/>
-        </w:rPr>
         <w:tab/>
       </w:r>
       <w:r>
-        <w:rPr>
-          <w:rFonts w:ascii="Times New Roman" w:hAnsi="Times New Roman" w:eastAsia="Times New Roman"/>
-          <w:b w:val="0"/>
-          <w:i w:val="0"/>
-          <w:sz w:val="28"/>
-        </w:rPr>
-        <w:t>∂f/∂x = 4x − 2y − 8,</w:t>
+        <w:drawing>
+          <wp:inline xmlns:a="http://schemas.openxmlformats.org/drawingml/2006/main" xmlns:pic="http://schemas.openxmlformats.org/drawingml/2006/picture">
+            <wp:extent cx="1883664" cy="390144"/>
+            <wp:docPr id="3" name="Picture 3"/>
+            <wp:cNvGraphicFramePr>
+              <a:graphicFrameLocks noChangeAspect="1"/>
+            </wp:cNvGraphicFramePr>
+            <a:graphic>
+              <a:graphicData uri="http://schemas.openxmlformats.org/drawingml/2006/picture">
+                <pic:pic>
+                  <pic:nvPicPr>
+                    <pic:cNvPr id="0" name="formula_576f244a65351b9f.png"/>
+                    <pic:cNvPicPr/>
+                  </pic:nvPicPr>
+                  <pic:blipFill>
+                    <a:blip r:embed="rId12"/>
+                    <a:stretch>
+                      <a:fillRect/>
+                    </a:stretch>
+                  </pic:blipFill>
+                  <pic:spPr>
+                    <a:xfrm>
+                      <a:off x="0" y="0"/>
+                      <a:ext cx="1883664" cy="390144"/>
+                    </a:xfrm>
+                    <a:prstGeom prst="rect"/>
+                  </pic:spPr>
+                </pic:pic>
+              </a:graphicData>
+            </a:graphic>
+          </wp:inline>
+        </w:drawing>
       </w:r>
       <w:r>
         <w:rPr>
@@ -1135,22 +1192,41 @@
         <w:spacing w:line="360" w:lineRule="auto" w:before="120" w:after="120"/>
       </w:pPr>
       <w:r>
-        <w:rPr>
-          <w:rFonts w:ascii="Times New Roman" w:hAnsi="Times New Roman" w:eastAsia="Times New Roman"/>
-          <w:b w:val="0"/>
-          <w:i w:val="0"/>
-          <w:sz w:val="28"/>
-        </w:rPr>
         <w:tab/>
       </w:r>
       <w:r>
-        <w:rPr>
-          <w:rFonts w:ascii="Times New Roman" w:hAnsi="Times New Roman" w:eastAsia="Times New Roman"/>
-          <w:b w:val="0"/>
-          <w:i w:val="0"/>
-          <w:sz w:val="28"/>
-        </w:rPr>
-        <w:t>∂f/∂y = −2x + 6y + 6.</w:t>
+        <w:drawing>
+          <wp:inline xmlns:a="http://schemas.openxmlformats.org/drawingml/2006/main" xmlns:pic="http://schemas.openxmlformats.org/drawingml/2006/picture">
+            <wp:extent cx="2072640" cy="420624"/>
+            <wp:docPr id="4" name="Picture 4"/>
+            <wp:cNvGraphicFramePr>
+              <a:graphicFrameLocks noChangeAspect="1"/>
+            </wp:cNvGraphicFramePr>
+            <a:graphic>
+              <a:graphicData uri="http://schemas.openxmlformats.org/drawingml/2006/picture">
+                <pic:pic>
+                  <pic:nvPicPr>
+                    <pic:cNvPr id="0" name="formula_7b6f200805e8b272.png"/>
+                    <pic:cNvPicPr/>
+                  </pic:nvPicPr>
+                  <pic:blipFill>
+                    <a:blip r:embed="rId13"/>
+                    <a:stretch>
+                      <a:fillRect/>
+                    </a:stretch>
+                  </pic:blipFill>
+                  <pic:spPr>
+                    <a:xfrm>
+                      <a:off x="0" y="0"/>
+                      <a:ext cx="2072640" cy="420624"/>
+                    </a:xfrm>
+                    <a:prstGeom prst="rect"/>
+                  </pic:spPr>
+                </pic:pic>
+              </a:graphicData>
+            </a:graphic>
+          </wp:inline>
+        </w:drawing>
       </w:r>
       <w:r>
         <w:rPr>
@@ -1200,13 +1276,38 @@
         <w:jc w:val="center"/>
       </w:pPr>
       <w:r>
-        <w:rPr>
-          <w:rFonts w:ascii="Times New Roman" w:hAnsi="Times New Roman" w:eastAsia="Times New Roman"/>
-          <w:b w:val="0"/>
-          <w:i w:val="0"/>
-          <w:sz w:val="28"/>
-        </w:rPr>
-        <w:t>⎧ 4x − 2y − 8 = 0,    ⎨   −2x + 6y + 6 = 0.</w:t>
+        <w:drawing>
+          <wp:inline xmlns:a="http://schemas.openxmlformats.org/drawingml/2006/main" xmlns:pic="http://schemas.openxmlformats.org/drawingml/2006/picture">
+            <wp:extent cx="2270760" cy="548640"/>
+            <wp:docPr id="5" name="Picture 5"/>
+            <wp:cNvGraphicFramePr>
+              <a:graphicFrameLocks noChangeAspect="1"/>
+            </wp:cNvGraphicFramePr>
+            <a:graphic>
+              <a:graphicData uri="http://schemas.openxmlformats.org/drawingml/2006/picture">
+                <pic:pic>
+                  <pic:nvPicPr>
+                    <pic:cNvPr id="0" name="formula_21bb28e3bc8b3834.png"/>
+                    <pic:cNvPicPr/>
+                  </pic:nvPicPr>
+                  <pic:blipFill>
+                    <a:blip r:embed="rId14"/>
+                    <a:stretch>
+                      <a:fillRect/>
+                    </a:stretch>
+                  </pic:blipFill>
+                  <pic:spPr>
+                    <a:xfrm>
+                      <a:off x="0" y="0"/>
+                      <a:ext cx="2270760" cy="548640"/>
+                    </a:xfrm>
+                    <a:prstGeom prst="rect"/>
+                  </pic:spPr>
+                </pic:pic>
+              </a:graphicData>
+            </a:graphic>
+          </wp:inline>
+        </w:drawing>
       </w:r>
     </w:p>
     <w:p>
@@ -1234,22 +1335,41 @@
         <w:spacing w:line="360" w:lineRule="auto" w:before="120" w:after="120"/>
       </w:pPr>
       <w:r>
-        <w:rPr>
-          <w:rFonts w:ascii="Times New Roman" w:hAnsi="Times New Roman" w:eastAsia="Times New Roman"/>
-          <w:b w:val="0"/>
-          <w:i w:val="0"/>
-          <w:sz w:val="28"/>
-        </w:rPr>
         <w:tab/>
       </w:r>
       <w:r>
-        <w:rPr>
-          <w:rFonts w:ascii="Times New Roman" w:hAnsi="Times New Roman" w:eastAsia="Times New Roman"/>
-          <w:b w:val="0"/>
-          <w:i w:val="0"/>
-          <w:sz w:val="28"/>
-        </w:rPr>
-        <w:t>x* = (1,8;  −0,4),    f(x*) = 21,6.</w:t>
+        <w:drawing>
+          <wp:inline xmlns:a="http://schemas.openxmlformats.org/drawingml/2006/main" xmlns:pic="http://schemas.openxmlformats.org/drawingml/2006/picture">
+            <wp:extent cx="3733799" cy="323088"/>
+            <wp:docPr id="6" name="Picture 6"/>
+            <wp:cNvGraphicFramePr>
+              <a:graphicFrameLocks noChangeAspect="1"/>
+            </wp:cNvGraphicFramePr>
+            <a:graphic>
+              <a:graphicData uri="http://schemas.openxmlformats.org/drawingml/2006/picture">
+                <pic:pic>
+                  <pic:nvPicPr>
+                    <pic:cNvPr id="0" name="formula_f44d5f46db08595d.png"/>
+                    <pic:cNvPicPr/>
+                  </pic:nvPicPr>
+                  <pic:blipFill>
+                    <a:blip r:embed="rId15"/>
+                    <a:stretch>
+                      <a:fillRect/>
+                    </a:stretch>
+                  </pic:blipFill>
+                  <pic:spPr>
+                    <a:xfrm>
+                      <a:off x="0" y="0"/>
+                      <a:ext cx="3733799" cy="323088"/>
+                    </a:xfrm>
+                    <a:prstGeom prst="rect"/>
+                  </pic:spPr>
+                </pic:pic>
+              </a:graphicData>
+            </a:graphic>
+          </wp:inline>
+        </w:drawing>
       </w:r>
       <w:r>
         <w:rPr>
@@ -1299,13 +1419,38 @@
         <w:jc w:val="center"/>
       </w:pPr>
       <w:r>
-        <w:rPr>
-          <w:rFonts w:ascii="Times New Roman" w:hAnsi="Times New Roman" w:eastAsia="Times New Roman"/>
-          <w:b w:val="0"/>
-          <w:i w:val="0"/>
-          <w:sz w:val="28"/>
-        </w:rPr>
-        <w:t>∂²f/∂x² = 4,   ∂²f/∂y² = 6,   ∂²f/∂x∂y = −2.</w:t>
+        <w:drawing>
+          <wp:inline xmlns:a="http://schemas.openxmlformats.org/drawingml/2006/main" xmlns:pic="http://schemas.openxmlformats.org/drawingml/2006/picture">
+            <wp:extent cx="3261360" cy="481583"/>
+            <wp:docPr id="7" name="Picture 7"/>
+            <wp:cNvGraphicFramePr>
+              <a:graphicFrameLocks noChangeAspect="1"/>
+            </wp:cNvGraphicFramePr>
+            <a:graphic>
+              <a:graphicData uri="http://schemas.openxmlformats.org/drawingml/2006/picture">
+                <pic:pic>
+                  <pic:nvPicPr>
+                    <pic:cNvPr id="0" name="formula_0a505c27251f1bab.png"/>
+                    <pic:cNvPicPr/>
+                  </pic:nvPicPr>
+                  <pic:blipFill>
+                    <a:blip r:embed="rId16"/>
+                    <a:stretch>
+                      <a:fillRect/>
+                    </a:stretch>
+                  </pic:blipFill>
+                  <pic:spPr>
+                    <a:xfrm>
+                      <a:off x="0" y="0"/>
+                      <a:ext cx="3261360" cy="481583"/>
+                    </a:xfrm>
+                    <a:prstGeom prst="rect"/>
+                  </pic:spPr>
+                </pic:pic>
+              </a:graphicData>
+            </a:graphic>
+          </wp:inline>
+        </w:drawing>
       </w:r>
     </w:p>
     <w:p>
@@ -1333,22 +1478,41 @@
         <w:spacing w:line="360" w:lineRule="auto" w:before="120" w:after="120"/>
       </w:pPr>
       <w:r>
-        <w:rPr>
-          <w:rFonts w:ascii="Times New Roman" w:hAnsi="Times New Roman" w:eastAsia="Times New Roman"/>
-          <w:b w:val="0"/>
-          <w:i w:val="0"/>
-          <w:sz w:val="28"/>
-        </w:rPr>
         <w:tab/>
       </w:r>
       <w:r>
-        <w:rPr>
-          <w:rFonts w:ascii="Times New Roman" w:hAnsi="Times New Roman" w:eastAsia="Times New Roman"/>
-          <w:b w:val="0"/>
-          <w:i w:val="0"/>
-          <w:sz w:val="28"/>
-        </w:rPr>
-        <w:t>H = [[4, −2], [−2, 6]].</w:t>
+        <w:drawing>
+          <wp:inline xmlns:a="http://schemas.openxmlformats.org/drawingml/2006/main" xmlns:pic="http://schemas.openxmlformats.org/drawingml/2006/picture">
+            <wp:extent cx="1557528" cy="457200"/>
+            <wp:docPr id="8" name="Picture 8"/>
+            <wp:cNvGraphicFramePr>
+              <a:graphicFrameLocks noChangeAspect="1"/>
+            </wp:cNvGraphicFramePr>
+            <a:graphic>
+              <a:graphicData uri="http://schemas.openxmlformats.org/drawingml/2006/picture">
+                <pic:pic>
+                  <pic:nvPicPr>
+                    <pic:cNvPr id="0" name="formula_53a05b1fba2545de.png"/>
+                    <pic:cNvPicPr/>
+                  </pic:nvPicPr>
+                  <pic:blipFill>
+                    <a:blip r:embed="rId17"/>
+                    <a:stretch>
+                      <a:fillRect/>
+                    </a:stretch>
+                  </pic:blipFill>
+                  <pic:spPr>
+                    <a:xfrm>
+                      <a:off x="0" y="0"/>
+                      <a:ext cx="1557528" cy="457200"/>
+                    </a:xfrm>
+                    <a:prstGeom prst="rect"/>
+                  </pic:spPr>
+                </pic:pic>
+              </a:graphicData>
+            </a:graphic>
+          </wp:inline>
+        </w:drawing>
       </w:r>
       <w:r>
         <w:rPr>
@@ -1383,13 +1547,38 @@
         <w:jc w:val="center"/>
       </w:pPr>
       <w:r>
-        <w:rPr>
-          <w:rFonts w:ascii="Times New Roman" w:hAnsi="Times New Roman" w:eastAsia="Times New Roman"/>
-          <w:b w:val="0"/>
-          <w:i w:val="0"/>
-          <w:sz w:val="28"/>
-        </w:rPr>
-        <w:t>Δ₁ = 4 &gt; 0,    Δ₂ = det H = 4·6 − (−2)·(−2) = 20 &gt; 0.</w:t>
+        <w:drawing>
+          <wp:inline xmlns:a="http://schemas.openxmlformats.org/drawingml/2006/main" xmlns:pic="http://schemas.openxmlformats.org/drawingml/2006/picture">
+            <wp:extent cx="5919216" cy="295656"/>
+            <wp:docPr id="9" name="Picture 9"/>
+            <wp:cNvGraphicFramePr>
+              <a:graphicFrameLocks noChangeAspect="1"/>
+            </wp:cNvGraphicFramePr>
+            <a:graphic>
+              <a:graphicData uri="http://schemas.openxmlformats.org/drawingml/2006/picture">
+                <pic:pic>
+                  <pic:nvPicPr>
+                    <pic:cNvPr id="0" name="formula_e0f84d97c748b4c2.png"/>
+                    <pic:cNvPicPr/>
+                  </pic:nvPicPr>
+                  <pic:blipFill>
+                    <a:blip r:embed="rId18"/>
+                    <a:stretch>
+                      <a:fillRect/>
+                    </a:stretch>
+                  </pic:blipFill>
+                  <pic:spPr>
+                    <a:xfrm>
+                      <a:off x="0" y="0"/>
+                      <a:ext cx="5919216" cy="295656"/>
+                    </a:xfrm>
+                    <a:prstGeom prst="rect"/>
+                  </pic:spPr>
+                </pic:pic>
+              </a:graphicData>
+            </a:graphic>
+          </wp:inline>
+        </w:drawing>
       </w:r>
     </w:p>
     <w:p>
@@ -1906,22 +2095,41 @@
         <w:spacing w:line="360" w:lineRule="auto" w:before="120" w:after="120"/>
       </w:pPr>
       <w:r>
-        <w:rPr>
-          <w:rFonts w:ascii="Times New Roman" w:hAnsi="Times New Roman" w:eastAsia="Times New Roman"/>
-          <w:b w:val="0"/>
-          <w:i w:val="0"/>
-          <w:sz w:val="28"/>
-        </w:rPr>
         <w:tab/>
       </w:r>
       <w:r>
-        <w:rPr>
-          <w:rFonts w:ascii="Times New Roman" w:hAnsi="Times New Roman" w:eastAsia="Times New Roman"/>
-          <w:b w:val="0"/>
-          <w:i w:val="0"/>
-          <w:sz w:val="28"/>
-        </w:rPr>
-        <w:t>f(x) = ½·xᵀ·Q·x + bᵀ·x + c,</w:t>
+        <w:drawing>
+          <wp:inline xmlns:a="http://schemas.openxmlformats.org/drawingml/2006/main" xmlns:pic="http://schemas.openxmlformats.org/drawingml/2006/picture">
+            <wp:extent cx="2584704" cy="393192"/>
+            <wp:docPr id="10" name="Picture 10"/>
+            <wp:cNvGraphicFramePr>
+              <a:graphicFrameLocks noChangeAspect="1"/>
+            </wp:cNvGraphicFramePr>
+            <a:graphic>
+              <a:graphicData uri="http://schemas.openxmlformats.org/drawingml/2006/picture">
+                <pic:pic>
+                  <pic:nvPicPr>
+                    <pic:cNvPr id="0" name="formula_37616a99d3a3ea30.png"/>
+                    <pic:cNvPicPr/>
+                  </pic:nvPicPr>
+                  <pic:blipFill>
+                    <a:blip r:embed="rId19"/>
+                    <a:stretch>
+                      <a:fillRect/>
+                    </a:stretch>
+                  </pic:blipFill>
+                  <pic:spPr>
+                    <a:xfrm>
+                      <a:off x="0" y="0"/>
+                      <a:ext cx="2584704" cy="393192"/>
+                    </a:xfrm>
+                    <a:prstGeom prst="rect"/>
+                  </pic:spPr>
+                </pic:pic>
+              </a:graphicData>
+            </a:graphic>
+          </wp:inline>
+        </w:drawing>
       </w:r>
       <w:r>
         <w:rPr>
@@ -1947,16 +2155,54 @@
           <w:i w:val="0"/>
           <w:sz w:val="28"/>
         </w:rPr>
-        <w:t>где Q = [[4, −2], [−2, 6]], b = (−8; 6), c = 30. Градиент тогда</w:t>
+        <w:t>В этой записи матрица квадратичной формы, вектор линейных коэффициентов и свободный член равны:</w:t>
       </w:r>
     </w:p>
     <w:p>
       <w:pPr>
-        <w:tabs>
-          <w:tab w:pos="4535" w:val="center"/>
-          <w:tab w:pos="9071" w:val="right"/>
-        </w:tabs>
         <w:spacing w:line="360" w:lineRule="auto" w:before="120" w:after="120"/>
+        <w:jc w:val="center"/>
+      </w:pPr>
+      <w:r>
+        <w:drawing>
+          <wp:inline xmlns:a="http://schemas.openxmlformats.org/drawingml/2006/main" xmlns:pic="http://schemas.openxmlformats.org/drawingml/2006/picture">
+            <wp:extent cx="3950208" cy="487680"/>
+            <wp:docPr id="11" name="Picture 11"/>
+            <wp:cNvGraphicFramePr>
+              <a:graphicFrameLocks noChangeAspect="1"/>
+            </wp:cNvGraphicFramePr>
+            <a:graphic>
+              <a:graphicData uri="http://schemas.openxmlformats.org/drawingml/2006/picture">
+                <pic:pic>
+                  <pic:nvPicPr>
+                    <pic:cNvPr id="0" name="formula_95a147ec8a63cc1d.png"/>
+                    <pic:cNvPicPr/>
+                  </pic:nvPicPr>
+                  <pic:blipFill>
+                    <a:blip r:embed="rId20"/>
+                    <a:stretch>
+                      <a:fillRect/>
+                    </a:stretch>
+                  </pic:blipFill>
+                  <pic:spPr>
+                    <a:xfrm>
+                      <a:off x="0" y="0"/>
+                      <a:ext cx="3950208" cy="487680"/>
+                    </a:xfrm>
+                    <a:prstGeom prst="rect"/>
+                  </pic:spPr>
+                </pic:pic>
+              </a:graphicData>
+            </a:graphic>
+          </wp:inline>
+        </w:drawing>
+      </w:r>
+    </w:p>
+    <w:p>
+      <w:pPr>
+        <w:spacing w:line="360" w:lineRule="auto" w:after="0" w:before="0"/>
+        <w:ind w:firstLine="709"/>
+        <w:jc w:val="both"/>
       </w:pPr>
       <w:r>
         <w:rPr>
@@ -1965,16 +2211,53 @@
           <w:i w:val="0"/>
           <w:sz w:val="28"/>
         </w:rPr>
+        <w:t>Градиент тогда</w:t>
+      </w:r>
+    </w:p>
+    <w:p>
+      <w:pPr>
+        <w:tabs>
+          <w:tab w:pos="4535" w:val="center"/>
+          <w:tab w:pos="9071" w:val="right"/>
+        </w:tabs>
+        <w:spacing w:line="360" w:lineRule="auto" w:before="120" w:after="120"/>
+      </w:pPr>
+      <w:r>
         <w:tab/>
       </w:r>
       <w:r>
-        <w:rPr>
-          <w:rFonts w:ascii="Times New Roman" w:hAnsi="Times New Roman" w:eastAsia="Times New Roman"/>
-          <w:b w:val="0"/>
-          <w:i w:val="0"/>
-          <w:sz w:val="28"/>
-        </w:rPr>
-        <w:t>∇f(x) = Q·x + b.</w:t>
+        <w:drawing>
+          <wp:inline xmlns:a="http://schemas.openxmlformats.org/drawingml/2006/main" xmlns:pic="http://schemas.openxmlformats.org/drawingml/2006/picture">
+            <wp:extent cx="1694688" cy="292608"/>
+            <wp:docPr id="12" name="Picture 12"/>
+            <wp:cNvGraphicFramePr>
+              <a:graphicFrameLocks noChangeAspect="1"/>
+            </wp:cNvGraphicFramePr>
+            <a:graphic>
+              <a:graphicData uri="http://schemas.openxmlformats.org/drawingml/2006/picture">
+                <pic:pic>
+                  <pic:nvPicPr>
+                    <pic:cNvPr id="0" name="formula_e2b1c7e9c5d193c3.png"/>
+                    <pic:cNvPicPr/>
+                  </pic:nvPicPr>
+                  <pic:blipFill>
+                    <a:blip r:embed="rId21"/>
+                    <a:stretch>
+                      <a:fillRect/>
+                    </a:stretch>
+                  </pic:blipFill>
+                  <pic:spPr>
+                    <a:xfrm>
+                      <a:off x="0" y="0"/>
+                      <a:ext cx="1694688" cy="292608"/>
+                    </a:xfrm>
+                    <a:prstGeom prst="rect"/>
+                  </pic:spPr>
+                </pic:pic>
+              </a:graphicData>
+            </a:graphic>
+          </wp:inline>
+        </w:drawing>
       </w:r>
       <w:r>
         <w:rPr>
@@ -2012,22 +2295,41 @@
         <w:spacing w:line="360" w:lineRule="auto" w:before="120" w:after="120"/>
       </w:pPr>
       <w:r>
-        <w:rPr>
-          <w:rFonts w:ascii="Times New Roman" w:hAnsi="Times New Roman" w:eastAsia="Times New Roman"/>
-          <w:b w:val="0"/>
-          <w:i w:val="0"/>
-          <w:sz w:val="28"/>
-        </w:rPr>
         <w:tab/>
       </w:r>
       <w:r>
-        <w:rPr>
-          <w:rFonts w:ascii="Times New Roman" w:hAnsi="Times New Roman" w:eastAsia="Times New Roman"/>
-          <w:b w:val="0"/>
-          <w:i w:val="0"/>
-          <w:sz w:val="28"/>
-        </w:rPr>
-        <w:t>x_{k+1} = x_k − α_k · ∇f(x_k),    α_k = (gᵀg)/(gᵀQg).</w:t>
+        <w:drawing>
+          <wp:inline xmlns:a="http://schemas.openxmlformats.org/drawingml/2006/main" xmlns:pic="http://schemas.openxmlformats.org/drawingml/2006/picture">
+            <wp:extent cx="3663696" cy="509016"/>
+            <wp:docPr id="13" name="Picture 13"/>
+            <wp:cNvGraphicFramePr>
+              <a:graphicFrameLocks noChangeAspect="1"/>
+            </wp:cNvGraphicFramePr>
+            <a:graphic>
+              <a:graphicData uri="http://schemas.openxmlformats.org/drawingml/2006/picture">
+                <pic:pic>
+                  <pic:nvPicPr>
+                    <pic:cNvPr id="0" name="formula_1ea6923a2eda6ce9.png"/>
+                    <pic:cNvPicPr/>
+                  </pic:nvPicPr>
+                  <pic:blipFill>
+                    <a:blip r:embed="rId22"/>
+                    <a:stretch>
+                      <a:fillRect/>
+                    </a:stretch>
+                  </pic:blipFill>
+                  <pic:spPr>
+                    <a:xfrm>
+                      <a:off x="0" y="0"/>
+                      <a:ext cx="3663696" cy="509016"/>
+                    </a:xfrm>
+                    <a:prstGeom prst="rect"/>
+                  </pic:spPr>
+                </pic:pic>
+              </a:graphicData>
+            </a:graphic>
+          </wp:inline>
+        </w:drawing>
       </w:r>
       <w:r>
         <w:rPr>
@@ -2176,22 +2478,41 @@
         <w:spacing w:line="360" w:lineRule="auto" w:before="120" w:after="120"/>
       </w:pPr>
       <w:r>
-        <w:rPr>
-          <w:rFonts w:ascii="Times New Roman" w:hAnsi="Times New Roman" w:eastAsia="Times New Roman"/>
-          <w:b w:val="0"/>
-          <w:i w:val="0"/>
-          <w:sz w:val="28"/>
-        </w:rPr>
         <w:tab/>
       </w:r>
       <w:r>
-        <w:rPr>
-          <w:rFonts w:ascii="Times New Roman" w:hAnsi="Times New Roman" w:eastAsia="Times New Roman"/>
-          <w:b w:val="0"/>
-          <w:i w:val="0"/>
-          <w:sz w:val="28"/>
-        </w:rPr>
-        <w:t>d_0 = −∇f(x_0);</w:t>
+        <w:drawing>
+          <wp:inline xmlns:a="http://schemas.openxmlformats.org/drawingml/2006/main" xmlns:pic="http://schemas.openxmlformats.org/drawingml/2006/picture">
+            <wp:extent cx="1508760" cy="295656"/>
+            <wp:docPr id="14" name="Picture 14"/>
+            <wp:cNvGraphicFramePr>
+              <a:graphicFrameLocks noChangeAspect="1"/>
+            </wp:cNvGraphicFramePr>
+            <a:graphic>
+              <a:graphicData uri="http://schemas.openxmlformats.org/drawingml/2006/picture">
+                <pic:pic>
+                  <pic:nvPicPr>
+                    <pic:cNvPr id="0" name="formula_81c957fb5601f016.png"/>
+                    <pic:cNvPicPr/>
+                  </pic:nvPicPr>
+                  <pic:blipFill>
+                    <a:blip r:embed="rId23"/>
+                    <a:stretch>
+                      <a:fillRect/>
+                    </a:stretch>
+                  </pic:blipFill>
+                  <pic:spPr>
+                    <a:xfrm>
+                      <a:off x="0" y="0"/>
+                      <a:ext cx="1508760" cy="295656"/>
+                    </a:xfrm>
+                    <a:prstGeom prst="rect"/>
+                  </pic:spPr>
+                </pic:pic>
+              </a:graphicData>
+            </a:graphic>
+          </wp:inline>
+        </w:drawing>
       </w:r>
       <w:r>
         <w:rPr>
@@ -2213,22 +2534,41 @@
         <w:spacing w:line="360" w:lineRule="auto" w:before="120" w:after="120"/>
       </w:pPr>
       <w:r>
-        <w:rPr>
-          <w:rFonts w:ascii="Times New Roman" w:hAnsi="Times New Roman" w:eastAsia="Times New Roman"/>
-          <w:b w:val="0"/>
-          <w:i w:val="0"/>
-          <w:sz w:val="28"/>
-        </w:rPr>
         <w:tab/>
       </w:r>
       <w:r>
-        <w:rPr>
-          <w:rFonts w:ascii="Times New Roman" w:hAnsi="Times New Roman" w:eastAsia="Times New Roman"/>
-          <w:b w:val="0"/>
-          <w:i w:val="0"/>
-          <w:sz w:val="28"/>
-        </w:rPr>
-        <w:t>α_k = −(gᵀd_k)/(d_kᵀQd_k);</w:t>
+        <w:drawing>
+          <wp:inline xmlns:a="http://schemas.openxmlformats.org/drawingml/2006/main" xmlns:pic="http://schemas.openxmlformats.org/drawingml/2006/picture">
+            <wp:extent cx="1362456" cy="521207"/>
+            <wp:docPr id="15" name="Picture 15"/>
+            <wp:cNvGraphicFramePr>
+              <a:graphicFrameLocks noChangeAspect="1"/>
+            </wp:cNvGraphicFramePr>
+            <a:graphic>
+              <a:graphicData uri="http://schemas.openxmlformats.org/drawingml/2006/picture">
+                <pic:pic>
+                  <pic:nvPicPr>
+                    <pic:cNvPr id="0" name="formula_59b11f6175fb56a5.png"/>
+                    <pic:cNvPicPr/>
+                  </pic:nvPicPr>
+                  <pic:blipFill>
+                    <a:blip r:embed="rId24"/>
+                    <a:stretch>
+                      <a:fillRect/>
+                    </a:stretch>
+                  </pic:blipFill>
+                  <pic:spPr>
+                    <a:xfrm>
+                      <a:off x="0" y="0"/>
+                      <a:ext cx="1362456" cy="521207"/>
+                    </a:xfrm>
+                    <a:prstGeom prst="rect"/>
+                  </pic:spPr>
+                </pic:pic>
+              </a:graphicData>
+            </a:graphic>
+          </wp:inline>
+        </w:drawing>
       </w:r>
       <w:r>
         <w:rPr>
@@ -2250,22 +2590,41 @@
         <w:spacing w:line="360" w:lineRule="auto" w:before="120" w:after="120"/>
       </w:pPr>
       <w:r>
-        <w:rPr>
-          <w:rFonts w:ascii="Times New Roman" w:hAnsi="Times New Roman" w:eastAsia="Times New Roman"/>
-          <w:b w:val="0"/>
-          <w:i w:val="0"/>
-          <w:sz w:val="28"/>
-        </w:rPr>
         <w:tab/>
       </w:r>
       <w:r>
-        <w:rPr>
-          <w:rFonts w:ascii="Times New Roman" w:hAnsi="Times New Roman" w:eastAsia="Times New Roman"/>
-          <w:b w:val="0"/>
-          <w:i w:val="0"/>
-          <w:sz w:val="28"/>
-        </w:rPr>
-        <w:t>x_{k+1} = x_k + α_k · d_k;</w:t>
+        <w:drawing>
+          <wp:inline xmlns:a="http://schemas.openxmlformats.org/drawingml/2006/main" xmlns:pic="http://schemas.openxmlformats.org/drawingml/2006/picture">
+            <wp:extent cx="1956816" cy="295656"/>
+            <wp:docPr id="16" name="Picture 16"/>
+            <wp:cNvGraphicFramePr>
+              <a:graphicFrameLocks noChangeAspect="1"/>
+            </wp:cNvGraphicFramePr>
+            <a:graphic>
+              <a:graphicData uri="http://schemas.openxmlformats.org/drawingml/2006/picture">
+                <pic:pic>
+                  <pic:nvPicPr>
+                    <pic:cNvPr id="0" name="formula_92801cce141e99b4.png"/>
+                    <pic:cNvPicPr/>
+                  </pic:nvPicPr>
+                  <pic:blipFill>
+                    <a:blip r:embed="rId25"/>
+                    <a:stretch>
+                      <a:fillRect/>
+                    </a:stretch>
+                  </pic:blipFill>
+                  <pic:spPr>
+                    <a:xfrm>
+                      <a:off x="0" y="0"/>
+                      <a:ext cx="1956816" cy="295656"/>
+                    </a:xfrm>
+                    <a:prstGeom prst="rect"/>
+                  </pic:spPr>
+                </pic:pic>
+              </a:graphicData>
+            </a:graphic>
+          </wp:inline>
+        </w:drawing>
       </w:r>
       <w:r>
         <w:rPr>
@@ -2287,22 +2646,41 @@
         <w:spacing w:line="360" w:lineRule="auto" w:before="120" w:after="120"/>
       </w:pPr>
       <w:r>
-        <w:rPr>
-          <w:rFonts w:ascii="Times New Roman" w:hAnsi="Times New Roman" w:eastAsia="Times New Roman"/>
-          <w:b w:val="0"/>
-          <w:i w:val="0"/>
-          <w:sz w:val="28"/>
-        </w:rPr>
         <w:tab/>
       </w:r>
       <w:r>
-        <w:rPr>
-          <w:rFonts w:ascii="Times New Roman" w:hAnsi="Times New Roman" w:eastAsia="Times New Roman"/>
-          <w:b w:val="0"/>
-          <w:i w:val="0"/>
-          <w:sz w:val="28"/>
-        </w:rPr>
-        <w:t>β_k = ‖g_{k+1}‖² / ‖g_k‖²;</w:t>
+        <w:drawing>
+          <wp:inline xmlns:a="http://schemas.openxmlformats.org/drawingml/2006/main" xmlns:pic="http://schemas.openxmlformats.org/drawingml/2006/picture">
+            <wp:extent cx="1298448" cy="524256"/>
+            <wp:docPr id="17" name="Picture 17"/>
+            <wp:cNvGraphicFramePr>
+              <a:graphicFrameLocks noChangeAspect="1"/>
+            </wp:cNvGraphicFramePr>
+            <a:graphic>
+              <a:graphicData uri="http://schemas.openxmlformats.org/drawingml/2006/picture">
+                <pic:pic>
+                  <pic:nvPicPr>
+                    <pic:cNvPr id="0" name="formula_6fe9523a693e2a92.png"/>
+                    <pic:cNvPicPr/>
+                  </pic:nvPicPr>
+                  <pic:blipFill>
+                    <a:blip r:embed="rId26"/>
+                    <a:stretch>
+                      <a:fillRect/>
+                    </a:stretch>
+                  </pic:blipFill>
+                  <pic:spPr>
+                    <a:xfrm>
+                      <a:off x="0" y="0"/>
+                      <a:ext cx="1298448" cy="524256"/>
+                    </a:xfrm>
+                    <a:prstGeom prst="rect"/>
+                  </pic:spPr>
+                </pic:pic>
+              </a:graphicData>
+            </a:graphic>
+          </wp:inline>
+        </w:drawing>
       </w:r>
       <w:r>
         <w:rPr>
@@ -2324,22 +2702,41 @@
         <w:spacing w:line="360" w:lineRule="auto" w:before="120" w:after="120"/>
       </w:pPr>
       <w:r>
-        <w:rPr>
-          <w:rFonts w:ascii="Times New Roman" w:hAnsi="Times New Roman" w:eastAsia="Times New Roman"/>
-          <w:b w:val="0"/>
-          <w:i w:val="0"/>
-          <w:sz w:val="28"/>
-        </w:rPr>
         <w:tab/>
       </w:r>
       <w:r>
-        <w:rPr>
-          <w:rFonts w:ascii="Times New Roman" w:hAnsi="Times New Roman" w:eastAsia="Times New Roman"/>
-          <w:b w:val="0"/>
-          <w:i w:val="0"/>
-          <w:sz w:val="28"/>
-        </w:rPr>
-        <w:t>d_{k+1} = −g_{k+1} + β_k · d_k.</w:t>
+        <w:drawing>
+          <wp:inline xmlns:a="http://schemas.openxmlformats.org/drawingml/2006/main" xmlns:pic="http://schemas.openxmlformats.org/drawingml/2006/picture">
+            <wp:extent cx="2450592" cy="307848"/>
+            <wp:docPr id="18" name="Picture 18"/>
+            <wp:cNvGraphicFramePr>
+              <a:graphicFrameLocks noChangeAspect="1"/>
+            </wp:cNvGraphicFramePr>
+            <a:graphic>
+              <a:graphicData uri="http://schemas.openxmlformats.org/drawingml/2006/picture">
+                <pic:pic>
+                  <pic:nvPicPr>
+                    <pic:cNvPr id="0" name="formula_aa70011c83e12510.png"/>
+                    <pic:cNvPicPr/>
+                  </pic:nvPicPr>
+                  <pic:blipFill>
+                    <a:blip r:embed="rId27"/>
+                    <a:stretch>
+                      <a:fillRect/>
+                    </a:stretch>
+                  </pic:blipFill>
+                  <pic:spPr>
+                    <a:xfrm>
+                      <a:off x="0" y="0"/>
+                      <a:ext cx="2450592" cy="307848"/>
+                    </a:xfrm>
+                    <a:prstGeom prst="rect"/>
+                  </pic:spPr>
+                </pic:pic>
+              </a:graphicData>
+            </a:graphic>
+          </wp:inline>
+        </w:drawing>
       </w:r>
       <w:r>
         <w:rPr>

</xml_diff>

<commit_message>
Match report formula image sizing
</commit_message>
<xml_diff>
--- a/report_template.docx
+++ b/report_template.docx
@@ -809,7 +809,7 @@
       <w:r>
         <w:drawing>
           <wp:inline xmlns:a="http://schemas.openxmlformats.org/drawingml/2006/main" xmlns:pic="http://schemas.openxmlformats.org/drawingml/2006/picture">
-            <wp:extent cx="5145024" cy="335280"/>
+            <wp:extent cx="3450336" cy="283464"/>
             <wp:docPr id="1" name="Picture 1"/>
             <wp:cNvGraphicFramePr>
               <a:graphicFrameLocks noChangeAspect="1"/>
@@ -818,7 +818,7 @@
               <a:graphicData uri="http://schemas.openxmlformats.org/drawingml/2006/picture">
                 <pic:pic>
                   <pic:nvPicPr>
-                    <pic:cNvPr id="0" name="formula_040d1f4ad12540a6.png"/>
+                    <pic:cNvPr id="0" name="formula_0ae3ed43aa0276a2.png"/>
                     <pic:cNvPicPr/>
                   </pic:nvPicPr>
                   <pic:blipFill>
@@ -830,7 +830,7 @@
                   <pic:spPr>
                     <a:xfrm>
                       <a:off x="0" y="0"/>
-                      <a:ext cx="5145024" cy="335280"/>
+                      <a:ext cx="3450336" cy="283464"/>
                     </a:xfrm>
                     <a:prstGeom prst="rect"/>
                   </pic:spPr>
@@ -841,13 +841,15 @@
         </w:drawing>
       </w:r>
       <w:r>
+        <w:tab/>
+      </w:r>
+      <w:r>
         <w:rPr>
           <w:rFonts w:ascii="Times New Roman" w:hAnsi="Times New Roman" w:eastAsia="Times New Roman"/>
           <w:b w:val="0"/>
           <w:i w:val="0"/>
           <w:sz w:val="28"/>
         </w:rPr>
-        <w:tab/>
         <w:t>(2.1)</w:t>
       </w:r>
     </w:p>
@@ -1037,7 +1039,7 @@
       <w:r>
         <w:drawing>
           <wp:inline xmlns:a="http://schemas.openxmlformats.org/drawingml/2006/main" xmlns:pic="http://schemas.openxmlformats.org/drawingml/2006/picture">
-            <wp:extent cx="4523232" cy="335280"/>
+            <wp:extent cx="3026664" cy="283464"/>
             <wp:docPr id="2" name="Picture 2"/>
             <wp:cNvGraphicFramePr>
               <a:graphicFrameLocks noChangeAspect="1"/>
@@ -1046,7 +1048,7 @@
               <a:graphicData uri="http://schemas.openxmlformats.org/drawingml/2006/picture">
                 <pic:pic>
                   <pic:nvPicPr>
-                    <pic:cNvPr id="0" name="formula_c702f717c906531f.png"/>
+                    <pic:cNvPr id="0" name="formula_6bf2b4e2791165eb.png"/>
                     <pic:cNvPicPr/>
                   </pic:nvPicPr>
                   <pic:blipFill>
@@ -1058,7 +1060,7 @@
                   <pic:spPr>
                     <a:xfrm>
                       <a:off x="0" y="0"/>
-                      <a:ext cx="4523232" cy="335280"/>
+                      <a:ext cx="3026664" cy="283464"/>
                     </a:xfrm>
                     <a:prstGeom prst="rect"/>
                   </pic:spPr>
@@ -1069,13 +1071,15 @@
         </w:drawing>
       </w:r>
       <w:r>
+        <w:tab/>
+      </w:r>
+      <w:r>
         <w:rPr>
           <w:rFonts w:ascii="Times New Roman" w:hAnsi="Times New Roman" w:eastAsia="Times New Roman"/>
           <w:b w:val="0"/>
           <w:i w:val="0"/>
           <w:sz w:val="28"/>
         </w:rPr>
-        <w:tab/>
         <w:t>(3.1)</w:t>
       </w:r>
     </w:p>
@@ -1141,7 +1145,7 @@
       <w:r>
         <w:drawing>
           <wp:inline xmlns:a="http://schemas.openxmlformats.org/drawingml/2006/main" xmlns:pic="http://schemas.openxmlformats.org/drawingml/2006/picture">
-            <wp:extent cx="1883664" cy="390144"/>
+            <wp:extent cx="1271016" cy="356616"/>
             <wp:docPr id="3" name="Picture 3"/>
             <wp:cNvGraphicFramePr>
               <a:graphicFrameLocks noChangeAspect="1"/>
@@ -1150,7 +1154,7 @@
               <a:graphicData uri="http://schemas.openxmlformats.org/drawingml/2006/picture">
                 <pic:pic>
                   <pic:nvPicPr>
-                    <pic:cNvPr id="0" name="formula_576f244a65351b9f.png"/>
+                    <pic:cNvPr id="0" name="formula_2b06a3c5d6c425e4.png"/>
                     <pic:cNvPicPr/>
                   </pic:nvPicPr>
                   <pic:blipFill>
@@ -1162,7 +1166,7 @@
                   <pic:spPr>
                     <a:xfrm>
                       <a:off x="0" y="0"/>
-                      <a:ext cx="1883664" cy="390144"/>
+                      <a:ext cx="1271016" cy="356616"/>
                     </a:xfrm>
                     <a:prstGeom prst="rect"/>
                   </pic:spPr>
@@ -1173,13 +1177,15 @@
         </w:drawing>
       </w:r>
       <w:r>
+        <w:tab/>
+      </w:r>
+      <w:r>
         <w:rPr>
           <w:rFonts w:ascii="Times New Roman" w:hAnsi="Times New Roman" w:eastAsia="Times New Roman"/>
           <w:b w:val="0"/>
           <w:i w:val="0"/>
           <w:sz w:val="28"/>
         </w:rPr>
-        <w:tab/>
         <w:t>(3.2)</w:t>
       </w:r>
     </w:p>
@@ -1197,7 +1203,7 @@
       <w:r>
         <w:drawing>
           <wp:inline xmlns:a="http://schemas.openxmlformats.org/drawingml/2006/main" xmlns:pic="http://schemas.openxmlformats.org/drawingml/2006/picture">
-            <wp:extent cx="2072640" cy="420624"/>
+            <wp:extent cx="1399032" cy="381000"/>
             <wp:docPr id="4" name="Picture 4"/>
             <wp:cNvGraphicFramePr>
               <a:graphicFrameLocks noChangeAspect="1"/>
@@ -1206,7 +1212,7 @@
               <a:graphicData uri="http://schemas.openxmlformats.org/drawingml/2006/picture">
                 <pic:pic>
                   <pic:nvPicPr>
-                    <pic:cNvPr id="0" name="formula_7b6f200805e8b272.png"/>
+                    <pic:cNvPr id="0" name="formula_08272d2f6f22d4ae.png"/>
                     <pic:cNvPicPr/>
                   </pic:nvPicPr>
                   <pic:blipFill>
@@ -1218,7 +1224,7 @@
                   <pic:spPr>
                     <a:xfrm>
                       <a:off x="0" y="0"/>
-                      <a:ext cx="2072640" cy="420624"/>
+                      <a:ext cx="1399032" cy="381000"/>
                     </a:xfrm>
                     <a:prstGeom prst="rect"/>
                   </pic:spPr>
@@ -1229,13 +1235,15 @@
         </w:drawing>
       </w:r>
       <w:r>
+        <w:tab/>
+      </w:r>
+      <w:r>
         <w:rPr>
           <w:rFonts w:ascii="Times New Roman" w:hAnsi="Times New Roman" w:eastAsia="Times New Roman"/>
           <w:b w:val="0"/>
           <w:i w:val="0"/>
           <w:sz w:val="28"/>
         </w:rPr>
-        <w:tab/>
         <w:t>(3.3)</w:t>
       </w:r>
     </w:p>
@@ -1278,7 +1286,7 @@
       <w:r>
         <w:drawing>
           <wp:inline xmlns:a="http://schemas.openxmlformats.org/drawingml/2006/main" xmlns:pic="http://schemas.openxmlformats.org/drawingml/2006/picture">
-            <wp:extent cx="2270760" cy="548640"/>
+            <wp:extent cx="1545336" cy="454152"/>
             <wp:docPr id="5" name="Picture 5"/>
             <wp:cNvGraphicFramePr>
               <a:graphicFrameLocks noChangeAspect="1"/>
@@ -1287,7 +1295,7 @@
               <a:graphicData uri="http://schemas.openxmlformats.org/drawingml/2006/picture">
                 <pic:pic>
                   <pic:nvPicPr>
-                    <pic:cNvPr id="0" name="formula_21bb28e3bc8b3834.png"/>
+                    <pic:cNvPr id="0" name="formula_1bc66520dafac21f.png"/>
                     <pic:cNvPicPr/>
                   </pic:nvPicPr>
                   <pic:blipFill>
@@ -1299,7 +1307,7 @@
                   <pic:spPr>
                     <a:xfrm>
                       <a:off x="0" y="0"/>
-                      <a:ext cx="2270760" cy="548640"/>
+                      <a:ext cx="1545336" cy="454152"/>
                     </a:xfrm>
                     <a:prstGeom prst="rect"/>
                   </pic:spPr>
@@ -1340,7 +1348,7 @@
       <w:r>
         <w:drawing>
           <wp:inline xmlns:a="http://schemas.openxmlformats.org/drawingml/2006/main" xmlns:pic="http://schemas.openxmlformats.org/drawingml/2006/picture">
-            <wp:extent cx="3733799" cy="323088"/>
+            <wp:extent cx="2526792" cy="283464"/>
             <wp:docPr id="6" name="Picture 6"/>
             <wp:cNvGraphicFramePr>
               <a:graphicFrameLocks noChangeAspect="1"/>
@@ -1349,7 +1357,7 @@
               <a:graphicData uri="http://schemas.openxmlformats.org/drawingml/2006/picture">
                 <pic:pic>
                   <pic:nvPicPr>
-                    <pic:cNvPr id="0" name="formula_f44d5f46db08595d.png"/>
+                    <pic:cNvPr id="0" name="formula_c06d69c16a72f029.png"/>
                     <pic:cNvPicPr/>
                   </pic:nvPicPr>
                   <pic:blipFill>
@@ -1361,7 +1369,7 @@
                   <pic:spPr>
                     <a:xfrm>
                       <a:off x="0" y="0"/>
-                      <a:ext cx="3733799" cy="323088"/>
+                      <a:ext cx="2526792" cy="283464"/>
                     </a:xfrm>
                     <a:prstGeom prst="rect"/>
                   </pic:spPr>
@@ -1372,13 +1380,15 @@
         </w:drawing>
       </w:r>
       <w:r>
+        <w:tab/>
+      </w:r>
+      <w:r>
         <w:rPr>
           <w:rFonts w:ascii="Times New Roman" w:hAnsi="Times New Roman" w:eastAsia="Times New Roman"/>
           <w:b w:val="0"/>
           <w:i w:val="0"/>
           <w:sz w:val="28"/>
         </w:rPr>
-        <w:tab/>
         <w:t>(3.4)</w:t>
       </w:r>
     </w:p>
@@ -1421,7 +1431,7 @@
       <w:r>
         <w:drawing>
           <wp:inline xmlns:a="http://schemas.openxmlformats.org/drawingml/2006/main" xmlns:pic="http://schemas.openxmlformats.org/drawingml/2006/picture">
-            <wp:extent cx="3261360" cy="481583"/>
+            <wp:extent cx="2206752" cy="423672"/>
             <wp:docPr id="7" name="Picture 7"/>
             <wp:cNvGraphicFramePr>
               <a:graphicFrameLocks noChangeAspect="1"/>
@@ -1430,7 +1440,7 @@
               <a:graphicData uri="http://schemas.openxmlformats.org/drawingml/2006/picture">
                 <pic:pic>
                   <pic:nvPicPr>
-                    <pic:cNvPr id="0" name="formula_0a505c27251f1bab.png"/>
+                    <pic:cNvPr id="0" name="formula_9351d72f05a829d3.png"/>
                     <pic:cNvPicPr/>
                   </pic:nvPicPr>
                   <pic:blipFill>
@@ -1442,7 +1452,7 @@
                   <pic:spPr>
                     <a:xfrm>
                       <a:off x="0" y="0"/>
-                      <a:ext cx="3261360" cy="481583"/>
+                      <a:ext cx="2206752" cy="423672"/>
                     </a:xfrm>
                     <a:prstGeom prst="rect"/>
                   </pic:spPr>
@@ -1483,7 +1493,7 @@
       <w:r>
         <w:drawing>
           <wp:inline xmlns:a="http://schemas.openxmlformats.org/drawingml/2006/main" xmlns:pic="http://schemas.openxmlformats.org/drawingml/2006/picture">
-            <wp:extent cx="1557528" cy="457200"/>
+            <wp:extent cx="1094232" cy="377952"/>
             <wp:docPr id="8" name="Picture 8"/>
             <wp:cNvGraphicFramePr>
               <a:graphicFrameLocks noChangeAspect="1"/>
@@ -1492,7 +1502,7 @@
               <a:graphicData uri="http://schemas.openxmlformats.org/drawingml/2006/picture">
                 <pic:pic>
                   <pic:nvPicPr>
-                    <pic:cNvPr id="0" name="formula_53a05b1fba2545de.png"/>
+                    <pic:cNvPr id="0" name="formula_d2de14002a35ec1a.png"/>
                     <pic:cNvPicPr/>
                   </pic:nvPicPr>
                   <pic:blipFill>
@@ -1504,7 +1514,7 @@
                   <pic:spPr>
                     <a:xfrm>
                       <a:off x="0" y="0"/>
-                      <a:ext cx="1557528" cy="457200"/>
+                      <a:ext cx="1094232" cy="377952"/>
                     </a:xfrm>
                     <a:prstGeom prst="rect"/>
                   </pic:spPr>
@@ -1515,13 +1525,15 @@
         </w:drawing>
       </w:r>
       <w:r>
+        <w:tab/>
+      </w:r>
+      <w:r>
         <w:rPr>
           <w:rFonts w:ascii="Times New Roman" w:hAnsi="Times New Roman" w:eastAsia="Times New Roman"/>
           <w:b w:val="0"/>
           <w:i w:val="0"/>
           <w:sz w:val="28"/>
         </w:rPr>
-        <w:tab/>
         <w:t>(3.5)</w:t>
       </w:r>
     </w:p>
@@ -1549,7 +1561,7 @@
       <w:r>
         <w:drawing>
           <wp:inline xmlns:a="http://schemas.openxmlformats.org/drawingml/2006/main" xmlns:pic="http://schemas.openxmlformats.org/drawingml/2006/picture">
-            <wp:extent cx="5919216" cy="295656"/>
+            <wp:extent cx="4038600" cy="249935"/>
             <wp:docPr id="9" name="Picture 9"/>
             <wp:cNvGraphicFramePr>
               <a:graphicFrameLocks noChangeAspect="1"/>
@@ -1558,7 +1570,7 @@
               <a:graphicData uri="http://schemas.openxmlformats.org/drawingml/2006/picture">
                 <pic:pic>
                   <pic:nvPicPr>
-                    <pic:cNvPr id="0" name="formula_e0f84d97c748b4c2.png"/>
+                    <pic:cNvPr id="0" name="formula_5f677ed56787146b.png"/>
                     <pic:cNvPicPr/>
                   </pic:nvPicPr>
                   <pic:blipFill>
@@ -1570,7 +1582,7 @@
                   <pic:spPr>
                     <a:xfrm>
                       <a:off x="0" y="0"/>
-                      <a:ext cx="5919216" cy="295656"/>
+                      <a:ext cx="4038600" cy="249935"/>
                     </a:xfrm>
                     <a:prstGeom prst="rect"/>
                   </pic:spPr>
@@ -2100,7 +2112,7 @@
       <w:r>
         <w:drawing>
           <wp:inline xmlns:a="http://schemas.openxmlformats.org/drawingml/2006/main" xmlns:pic="http://schemas.openxmlformats.org/drawingml/2006/picture">
-            <wp:extent cx="2584704" cy="393192"/>
+            <wp:extent cx="1825752" cy="326136"/>
             <wp:docPr id="10" name="Picture 10"/>
             <wp:cNvGraphicFramePr>
               <a:graphicFrameLocks noChangeAspect="1"/>
@@ -2109,7 +2121,7 @@
               <a:graphicData uri="http://schemas.openxmlformats.org/drawingml/2006/picture">
                 <pic:pic>
                   <pic:nvPicPr>
-                    <pic:cNvPr id="0" name="formula_37616a99d3a3ea30.png"/>
+                    <pic:cNvPr id="0" name="formula_7c3177d42b0eb3b2.png"/>
                     <pic:cNvPicPr/>
                   </pic:nvPicPr>
                   <pic:blipFill>
@@ -2121,7 +2133,7 @@
                   <pic:spPr>
                     <a:xfrm>
                       <a:off x="0" y="0"/>
-                      <a:ext cx="2584704" cy="393192"/>
+                      <a:ext cx="1825752" cy="326136"/>
                     </a:xfrm>
                     <a:prstGeom prst="rect"/>
                   </pic:spPr>
@@ -2132,13 +2144,15 @@
         </w:drawing>
       </w:r>
       <w:r>
+        <w:tab/>
+      </w:r>
+      <w:r>
         <w:rPr>
           <w:rFonts w:ascii="Times New Roman" w:hAnsi="Times New Roman" w:eastAsia="Times New Roman"/>
           <w:b w:val="0"/>
           <w:i w:val="0"/>
           <w:sz w:val="28"/>
         </w:rPr>
-        <w:tab/>
         <w:t>(4.1)</w:t>
       </w:r>
     </w:p>
@@ -2166,7 +2180,7 @@
       <w:r>
         <w:drawing>
           <wp:inline xmlns:a="http://schemas.openxmlformats.org/drawingml/2006/main" xmlns:pic="http://schemas.openxmlformats.org/drawingml/2006/picture">
-            <wp:extent cx="3950208" cy="487680"/>
+            <wp:extent cx="2676144" cy="411480"/>
             <wp:docPr id="11" name="Picture 11"/>
             <wp:cNvGraphicFramePr>
               <a:graphicFrameLocks noChangeAspect="1"/>
@@ -2175,7 +2189,7 @@
               <a:graphicData uri="http://schemas.openxmlformats.org/drawingml/2006/picture">
                 <pic:pic>
                   <pic:nvPicPr>
-                    <pic:cNvPr id="0" name="formula_95a147ec8a63cc1d.png"/>
+                    <pic:cNvPr id="0" name="formula_c09d97efd61c2257.png"/>
                     <pic:cNvPicPr/>
                   </pic:nvPicPr>
                   <pic:blipFill>
@@ -2187,7 +2201,7 @@
                   <pic:spPr>
                     <a:xfrm>
                       <a:off x="0" y="0"/>
-                      <a:ext cx="3950208" cy="487680"/>
+                      <a:ext cx="2676144" cy="411480"/>
                     </a:xfrm>
                     <a:prstGeom prst="rect"/>
                   </pic:spPr>
@@ -2228,7 +2242,7 @@
       <w:r>
         <w:drawing>
           <wp:inline xmlns:a="http://schemas.openxmlformats.org/drawingml/2006/main" xmlns:pic="http://schemas.openxmlformats.org/drawingml/2006/picture">
-            <wp:extent cx="1694688" cy="292608"/>
+            <wp:extent cx="1203960" cy="259080"/>
             <wp:docPr id="12" name="Picture 12"/>
             <wp:cNvGraphicFramePr>
               <a:graphicFrameLocks noChangeAspect="1"/>
@@ -2237,7 +2251,7 @@
               <a:graphicData uri="http://schemas.openxmlformats.org/drawingml/2006/picture">
                 <pic:pic>
                   <pic:nvPicPr>
-                    <pic:cNvPr id="0" name="formula_e2b1c7e9c5d193c3.png"/>
+                    <pic:cNvPr id="0" name="formula_8d8e17705c20f16c.png"/>
                     <pic:cNvPicPr/>
                   </pic:nvPicPr>
                   <pic:blipFill>
@@ -2249,7 +2263,7 @@
                   <pic:spPr>
                     <a:xfrm>
                       <a:off x="0" y="0"/>
-                      <a:ext cx="1694688" cy="292608"/>
+                      <a:ext cx="1203960" cy="259080"/>
                     </a:xfrm>
                     <a:prstGeom prst="rect"/>
                   </pic:spPr>
@@ -2260,13 +2274,15 @@
         </w:drawing>
       </w:r>
       <w:r>
+        <w:tab/>
+      </w:r>
+      <w:r>
         <w:rPr>
           <w:rFonts w:ascii="Times New Roman" w:hAnsi="Times New Roman" w:eastAsia="Times New Roman"/>
           <w:b w:val="0"/>
           <w:i w:val="0"/>
           <w:sz w:val="28"/>
         </w:rPr>
-        <w:tab/>
         <w:t>(4.2)</w:t>
       </w:r>
     </w:p>
@@ -2300,7 +2316,7 @@
       <w:r>
         <w:drawing>
           <wp:inline xmlns:a="http://schemas.openxmlformats.org/drawingml/2006/main" xmlns:pic="http://schemas.openxmlformats.org/drawingml/2006/picture">
-            <wp:extent cx="3663696" cy="509016"/>
+            <wp:extent cx="2523744" cy="420624"/>
             <wp:docPr id="13" name="Picture 13"/>
             <wp:cNvGraphicFramePr>
               <a:graphicFrameLocks noChangeAspect="1"/>
@@ -2309,7 +2325,7 @@
               <a:graphicData uri="http://schemas.openxmlformats.org/drawingml/2006/picture">
                 <pic:pic>
                   <pic:nvPicPr>
-                    <pic:cNvPr id="0" name="formula_1ea6923a2eda6ce9.png"/>
+                    <pic:cNvPr id="0" name="formula_797ee31a9e87b90f.png"/>
                     <pic:cNvPicPr/>
                   </pic:nvPicPr>
                   <pic:blipFill>
@@ -2321,7 +2337,7 @@
                   <pic:spPr>
                     <a:xfrm>
                       <a:off x="0" y="0"/>
-                      <a:ext cx="3663696" cy="509016"/>
+                      <a:ext cx="2523744" cy="420624"/>
                     </a:xfrm>
                     <a:prstGeom prst="rect"/>
                   </pic:spPr>
@@ -2332,13 +2348,15 @@
         </w:drawing>
       </w:r>
       <w:r>
+        <w:tab/>
+      </w:r>
+      <w:r>
         <w:rPr>
           <w:rFonts w:ascii="Times New Roman" w:hAnsi="Times New Roman" w:eastAsia="Times New Roman"/>
           <w:b w:val="0"/>
           <w:i w:val="0"/>
           <w:sz w:val="28"/>
         </w:rPr>
-        <w:tab/>
         <w:t>(4.3)</w:t>
       </w:r>
     </w:p>
@@ -2483,7 +2501,7 @@
       <w:r>
         <w:drawing>
           <wp:inline xmlns:a="http://schemas.openxmlformats.org/drawingml/2006/main" xmlns:pic="http://schemas.openxmlformats.org/drawingml/2006/picture">
-            <wp:extent cx="1508760" cy="295656"/>
+            <wp:extent cx="1085088" cy="259080"/>
             <wp:docPr id="14" name="Picture 14"/>
             <wp:cNvGraphicFramePr>
               <a:graphicFrameLocks noChangeAspect="1"/>
@@ -2492,7 +2510,7 @@
               <a:graphicData uri="http://schemas.openxmlformats.org/drawingml/2006/picture">
                 <pic:pic>
                   <pic:nvPicPr>
-                    <pic:cNvPr id="0" name="formula_81c957fb5601f016.png"/>
+                    <pic:cNvPr id="0" name="formula_c1afcd46a4a78640.png"/>
                     <pic:cNvPicPr/>
                   </pic:nvPicPr>
                   <pic:blipFill>
@@ -2504,7 +2522,7 @@
                   <pic:spPr>
                     <a:xfrm>
                       <a:off x="0" y="0"/>
-                      <a:ext cx="1508760" cy="295656"/>
+                      <a:ext cx="1085088" cy="259080"/>
                     </a:xfrm>
                     <a:prstGeom prst="rect"/>
                   </pic:spPr>
@@ -2515,13 +2533,15 @@
         </w:drawing>
       </w:r>
       <w:r>
+        <w:tab/>
+      </w:r>
+      <w:r>
         <w:rPr>
           <w:rFonts w:ascii="Times New Roman" w:hAnsi="Times New Roman" w:eastAsia="Times New Roman"/>
           <w:b w:val="0"/>
           <w:i w:val="0"/>
           <w:sz w:val="28"/>
         </w:rPr>
-        <w:tab/>
         <w:t>(4.4)</w:t>
       </w:r>
     </w:p>
@@ -2539,7 +2559,7 @@
       <w:r>
         <w:drawing>
           <wp:inline xmlns:a="http://schemas.openxmlformats.org/drawingml/2006/main" xmlns:pic="http://schemas.openxmlformats.org/drawingml/2006/picture">
-            <wp:extent cx="1362456" cy="521207"/>
+            <wp:extent cx="981455" cy="429768"/>
             <wp:docPr id="15" name="Picture 15"/>
             <wp:cNvGraphicFramePr>
               <a:graphicFrameLocks noChangeAspect="1"/>
@@ -2548,7 +2568,7 @@
               <a:graphicData uri="http://schemas.openxmlformats.org/drawingml/2006/picture">
                 <pic:pic>
                   <pic:nvPicPr>
-                    <pic:cNvPr id="0" name="formula_59b11f6175fb56a5.png"/>
+                    <pic:cNvPr id="0" name="formula_a7ad95896f629aaa.png"/>
                     <pic:cNvPicPr/>
                   </pic:nvPicPr>
                   <pic:blipFill>
@@ -2560,7 +2580,7 @@
                   <pic:spPr>
                     <a:xfrm>
                       <a:off x="0" y="0"/>
-                      <a:ext cx="1362456" cy="521207"/>
+                      <a:ext cx="981455" cy="429768"/>
                     </a:xfrm>
                     <a:prstGeom prst="rect"/>
                   </pic:spPr>
@@ -2571,13 +2591,15 @@
         </w:drawing>
       </w:r>
       <w:r>
+        <w:tab/>
+      </w:r>
+      <w:r>
         <w:rPr>
           <w:rFonts w:ascii="Times New Roman" w:hAnsi="Times New Roman" w:eastAsia="Times New Roman"/>
           <w:b w:val="0"/>
           <w:i w:val="0"/>
           <w:sz w:val="28"/>
         </w:rPr>
-        <w:tab/>
         <w:t>(4.5)</w:t>
       </w:r>
     </w:p>
@@ -2595,7 +2617,7 @@
       <w:r>
         <w:drawing>
           <wp:inline xmlns:a="http://schemas.openxmlformats.org/drawingml/2006/main" xmlns:pic="http://schemas.openxmlformats.org/drawingml/2006/picture">
-            <wp:extent cx="1956816" cy="295656"/>
+            <wp:extent cx="1331976" cy="246888"/>
             <wp:docPr id="16" name="Picture 16"/>
             <wp:cNvGraphicFramePr>
               <a:graphicFrameLocks noChangeAspect="1"/>
@@ -2604,7 +2626,7 @@
               <a:graphicData uri="http://schemas.openxmlformats.org/drawingml/2006/picture">
                 <pic:pic>
                   <pic:nvPicPr>
-                    <pic:cNvPr id="0" name="formula_92801cce141e99b4.png"/>
+                    <pic:cNvPr id="0" name="formula_2d679309705c2047.png"/>
                     <pic:cNvPicPr/>
                   </pic:nvPicPr>
                   <pic:blipFill>
@@ -2616,7 +2638,7 @@
                   <pic:spPr>
                     <a:xfrm>
                       <a:off x="0" y="0"/>
-                      <a:ext cx="1956816" cy="295656"/>
+                      <a:ext cx="1331976" cy="246888"/>
                     </a:xfrm>
                     <a:prstGeom prst="rect"/>
                   </pic:spPr>
@@ -2627,13 +2649,15 @@
         </w:drawing>
       </w:r>
       <w:r>
+        <w:tab/>
+      </w:r>
+      <w:r>
         <w:rPr>
           <w:rFonts w:ascii="Times New Roman" w:hAnsi="Times New Roman" w:eastAsia="Times New Roman"/>
           <w:b w:val="0"/>
           <w:i w:val="0"/>
           <w:sz w:val="28"/>
         </w:rPr>
-        <w:tab/>
         <w:t>(4.6)</w:t>
       </w:r>
     </w:p>
@@ -2651,7 +2675,7 @@
       <w:r>
         <w:drawing>
           <wp:inline xmlns:a="http://schemas.openxmlformats.org/drawingml/2006/main" xmlns:pic="http://schemas.openxmlformats.org/drawingml/2006/picture">
-            <wp:extent cx="1298448" cy="524256"/>
+            <wp:extent cx="947928" cy="423672"/>
             <wp:docPr id="17" name="Picture 17"/>
             <wp:cNvGraphicFramePr>
               <a:graphicFrameLocks noChangeAspect="1"/>
@@ -2660,7 +2684,7 @@
               <a:graphicData uri="http://schemas.openxmlformats.org/drawingml/2006/picture">
                 <pic:pic>
                   <pic:nvPicPr>
-                    <pic:cNvPr id="0" name="formula_6fe9523a693e2a92.png"/>
+                    <pic:cNvPr id="0" name="formula_b8670246972e90d6.png"/>
                     <pic:cNvPicPr/>
                   </pic:nvPicPr>
                   <pic:blipFill>
@@ -2672,7 +2696,7 @@
                   <pic:spPr>
                     <a:xfrm>
                       <a:off x="0" y="0"/>
-                      <a:ext cx="1298448" cy="524256"/>
+                      <a:ext cx="947928" cy="423672"/>
                     </a:xfrm>
                     <a:prstGeom prst="rect"/>
                   </pic:spPr>
@@ -2683,13 +2707,15 @@
         </w:drawing>
       </w:r>
       <w:r>
+        <w:tab/>
+      </w:r>
+      <w:r>
         <w:rPr>
           <w:rFonts w:ascii="Times New Roman" w:hAnsi="Times New Roman" w:eastAsia="Times New Roman"/>
           <w:b w:val="0"/>
           <w:i w:val="0"/>
           <w:sz w:val="28"/>
         </w:rPr>
-        <w:tab/>
         <w:t>(4.7)</w:t>
       </w:r>
     </w:p>
@@ -2707,7 +2733,7 @@
       <w:r>
         <w:drawing>
           <wp:inline xmlns:a="http://schemas.openxmlformats.org/drawingml/2006/main" xmlns:pic="http://schemas.openxmlformats.org/drawingml/2006/picture">
-            <wp:extent cx="2450592" cy="307848"/>
+            <wp:extent cx="1661160" cy="259080"/>
             <wp:docPr id="18" name="Picture 18"/>
             <wp:cNvGraphicFramePr>
               <a:graphicFrameLocks noChangeAspect="1"/>
@@ -2716,7 +2742,7 @@
               <a:graphicData uri="http://schemas.openxmlformats.org/drawingml/2006/picture">
                 <pic:pic>
                   <pic:nvPicPr>
-                    <pic:cNvPr id="0" name="formula_aa70011c83e12510.png"/>
+                    <pic:cNvPr id="0" name="formula_7f3d4dfbf190c607.png"/>
                     <pic:cNvPicPr/>
                   </pic:nvPicPr>
                   <pic:blipFill>
@@ -2728,7 +2754,7 @@
                   <pic:spPr>
                     <a:xfrm>
                       <a:off x="0" y="0"/>
-                      <a:ext cx="2450592" cy="307848"/>
+                      <a:ext cx="1661160" cy="259080"/>
                     </a:xfrm>
                     <a:prstGeom prst="rect"/>
                   </pic:spPr>
@@ -2739,13 +2765,15 @@
         </w:drawing>
       </w:r>
       <w:r>
+        <w:tab/>
+      </w:r>
+      <w:r>
         <w:rPr>
           <w:rFonts w:ascii="Times New Roman" w:hAnsi="Times New Roman" w:eastAsia="Times New Roman"/>
           <w:b w:val="0"/>
           <w:i w:val="0"/>
           <w:sz w:val="28"/>
         </w:rPr>
-        <w:tab/>
         <w:t>(4.8)</w:t>
       </w:r>
     </w:p>

</xml_diff>